<commit_message>
enhance documentation on PostgreSQL usage for concurrent seat booking and introduce limitations and solutions for application-level logic
</commit_message>
<xml_diff>
--- a/cinema_document.docx
+++ b/cinema_document.docx
@@ -707,15 +707,7 @@
           <w:sz w:val="26"/>
           <w:szCs w:val="26"/>
         </w:rPr>
-        <w:t>Lưu trữ dữ liệu nghiệp vụ (người dùng, phim, suất chiếu, vé, ghế)</w:t>
-      </w:r>
-      <w:r>
-        <w:rPr>
-          <w:rFonts w:ascii="Times New Roman" w:hAnsi="Times New Roman" w:cs="Times New Roman"/>
-          <w:sz w:val="26"/>
-          <w:szCs w:val="26"/>
-        </w:rPr>
-        <w:t>.</w:t>
+        <w:t>PostgreSQL được sử dụng để lưu trữ dữ liệu nghiệp vụ cốt lõi của hệ thống như người dùng, phim, suất chiếu, ghế và vé.</w:t>
       </w:r>
     </w:p>
     <w:p>
@@ -733,47 +725,86 @@
           <w:szCs w:val="26"/>
         </w:rPr>
         <w:lastRenderedPageBreak/>
-        <w:t>Sử dụng</w:t>
-      </w:r>
-      <w:r>
-        <w:rPr>
-          <w:rFonts w:ascii="Times New Roman" w:hAnsi="Times New Roman" w:cs="Times New Roman"/>
-          <w:sz w:val="26"/>
-          <w:szCs w:val="26"/>
-        </w:rPr>
-        <w:t xml:space="preserve"> TRANSACTION</w:t>
-      </w:r>
-      <w:r>
-        <w:rPr>
-          <w:rFonts w:ascii="Times New Roman" w:hAnsi="Times New Roman" w:cs="Times New Roman"/>
-          <w:sz w:val="26"/>
-          <w:szCs w:val="26"/>
-        </w:rPr>
-        <w:t xml:space="preserve"> và </w:t>
-      </w:r>
-      <w:r>
-        <w:rPr>
-          <w:rFonts w:ascii="Times New Roman" w:hAnsi="Times New Roman" w:cs="Times New Roman"/>
-          <w:sz w:val="26"/>
-          <w:szCs w:val="26"/>
-        </w:rPr>
-        <w:t xml:space="preserve">SELECT … FOR UPDATE </w:t>
-      </w:r>
-      <w:r>
-        <w:rPr>
-          <w:rFonts w:ascii="Times New Roman" w:hAnsi="Times New Roman" w:cs="Times New Roman"/>
-          <w:sz w:val="26"/>
-          <w:szCs w:val="26"/>
-        </w:rPr>
-        <w:t xml:space="preserve">để xử lý đặt vé đồng </w:t>
-      </w:r>
-      <w:r>
-        <w:rPr>
-          <w:rFonts w:ascii="Times New Roman" w:hAnsi="Times New Roman" w:cs="Times New Roman"/>
-          <w:sz w:val="26"/>
-          <w:szCs w:val="26"/>
-        </w:rPr>
-        <w:t>thời, cách hoạt động:</w:t>
+        <w:t xml:space="preserve">Để xử lý bài toán </w:t>
+      </w:r>
+      <w:r>
+        <w:rPr>
+          <w:rFonts w:ascii="Times New Roman" w:hAnsi="Times New Roman" w:cs="Times New Roman"/>
+          <w:b/>
+          <w:bCs/>
+          <w:sz w:val="26"/>
+          <w:szCs w:val="26"/>
+        </w:rPr>
+        <w:t>đặt vé đồng thời</w:t>
+      </w:r>
+      <w:r>
+        <w:rPr>
+          <w:rFonts w:ascii="Times New Roman" w:hAnsi="Times New Roman" w:cs="Times New Roman"/>
+          <w:sz w:val="26"/>
+          <w:szCs w:val="26"/>
+        </w:rPr>
+        <w:t xml:space="preserve"> (concurrent seat booking), hệ thống sử dụng </w:t>
+      </w:r>
+      <w:r>
+        <w:rPr>
+          <w:rFonts w:ascii="Times New Roman" w:hAnsi="Times New Roman" w:cs="Times New Roman"/>
+          <w:b/>
+          <w:bCs/>
+          <w:sz w:val="26"/>
+          <w:szCs w:val="26"/>
+        </w:rPr>
+        <w:t>Transaction</w:t>
+      </w:r>
+      <w:r>
+        <w:rPr>
+          <w:rFonts w:ascii="Times New Roman" w:hAnsi="Times New Roman" w:cs="Times New Roman"/>
+          <w:sz w:val="26"/>
+          <w:szCs w:val="26"/>
+        </w:rPr>
+        <w:t xml:space="preserve"> kết hợp với </w:t>
+      </w:r>
+      <w:r>
+        <w:rPr>
+          <w:rFonts w:ascii="Times New Roman" w:hAnsi="Times New Roman" w:cs="Times New Roman"/>
+          <w:b/>
+          <w:bCs/>
+          <w:sz w:val="26"/>
+          <w:szCs w:val="26"/>
+        </w:rPr>
+        <w:t>SELECT … FOR UPDATE</w:t>
+      </w:r>
+      <w:r>
+        <w:rPr>
+          <w:rFonts w:ascii="Times New Roman" w:hAnsi="Times New Roman" w:cs="Times New Roman"/>
+          <w:sz w:val="26"/>
+          <w:szCs w:val="26"/>
+        </w:rPr>
+        <w:t xml:space="preserve"> nhằm đảm bảo tính nhất quán dữ liệu trong môi trường có mức độ tranh chấp cao.</w:t>
+      </w:r>
+    </w:p>
+    <w:p>
+      <w:pPr>
+        <w:rPr>
+          <w:rFonts w:ascii="Times New Roman" w:hAnsi="Times New Roman" w:cs="Times New Roman"/>
+          <w:sz w:val="26"/>
+          <w:szCs w:val="26"/>
+        </w:rPr>
+      </w:pPr>
+      <w:r>
+        <w:rPr>
+          <w:rFonts w:ascii="Times New Roman" w:hAnsi="Times New Roman" w:cs="Times New Roman"/>
+          <w:sz w:val="26"/>
+          <w:szCs w:val="26"/>
+        </w:rPr>
+        <w:t xml:space="preserve">Cơ chế hoạt </w:t>
+      </w:r>
+      <w:r>
+        <w:rPr>
+          <w:rFonts w:ascii="Times New Roman" w:hAnsi="Times New Roman" w:cs="Times New Roman"/>
+          <w:sz w:val="26"/>
+          <w:szCs w:val="26"/>
+        </w:rPr>
+        <w:t>động:</w:t>
       </w:r>
     </w:p>
     <w:p>
@@ -795,7 +826,39 @@
           <w:sz w:val="26"/>
           <w:szCs w:val="26"/>
         </w:rPr>
-        <w:t>Câu lệnh SELECT … FOR UPDATE chủ động đặt khóa ngay khi đọc dữ liệu để ngăn chặn các giao dịch khác sửa đổi hoặc khóa các bản ghi đó cho đến khi transction hiện tại kết thúc (COMMIT hoặc ROLLBACK)</w:t>
+        <w:t xml:space="preserve">Câu lệnh </w:t>
+      </w:r>
+      <w:r>
+        <w:rPr>
+          <w:rFonts w:ascii="Times New Roman" w:hAnsi="Times New Roman" w:cs="Times New Roman"/>
+          <w:sz w:val="26"/>
+          <w:szCs w:val="26"/>
+        </w:rPr>
+        <w:t>‘</w:t>
+      </w:r>
+      <w:r>
+        <w:rPr>
+          <w:rFonts w:ascii="Times New Roman" w:hAnsi="Times New Roman" w:cs="Times New Roman"/>
+          <w:sz w:val="26"/>
+          <w:szCs w:val="26"/>
+        </w:rPr>
+        <w:t xml:space="preserve">SELECT … FOR </w:t>
+      </w:r>
+      <w:r>
+        <w:rPr>
+          <w:rFonts w:ascii="Times New Roman" w:hAnsi="Times New Roman" w:cs="Times New Roman"/>
+          <w:sz w:val="26"/>
+          <w:szCs w:val="26"/>
+        </w:rPr>
+        <w:t>UPDATE’</w:t>
+      </w:r>
+      <w:r>
+        <w:rPr>
+          <w:rFonts w:ascii="Times New Roman" w:hAnsi="Times New Roman" w:cs="Times New Roman"/>
+          <w:sz w:val="26"/>
+          <w:szCs w:val="26"/>
+        </w:rPr>
+        <w:t xml:space="preserve"> chủ động đặt khóa ngay khi đọc dữ liệu để ngăn chặn các giao dịch khác sửa đổi hoặc khóa các bản ghi đó cho đến khi transction hiện tại kết thúc (COMMIT hoặc ROLLBACK)</w:t>
       </w:r>
       <w:r>
         <w:rPr>
@@ -891,6 +954,1048 @@
           <w:sz w:val="26"/>
           <w:szCs w:val="26"/>
         </w:rPr>
+        <w:t>Hạn chế của cách tiếp cận cũ ở tầng ứng dụng</w:t>
+      </w:r>
+    </w:p>
+    <w:p>
+      <w:pPr>
+        <w:rPr>
+          <w:rFonts w:ascii="Times New Roman" w:hAnsi="Times New Roman" w:cs="Times New Roman"/>
+          <w:sz w:val="26"/>
+          <w:szCs w:val="26"/>
+        </w:rPr>
+      </w:pPr>
+      <w:r>
+        <w:rPr>
+          <w:rFonts w:ascii="Times New Roman" w:hAnsi="Times New Roman" w:cs="Times New Roman"/>
+          <w:sz w:val="26"/>
+          <w:szCs w:val="26"/>
+        </w:rPr>
+        <w:t>Trong phiên bản trước, logic đặt ghế được triển khai ở tầng application, dù vẫn nằm trong cùng một transaction nhưng:</w:t>
+      </w:r>
+      <w:r>
+        <w:rPr>
+          <w:rFonts w:ascii="Times New Roman" w:hAnsi="Times New Roman" w:cs="Times New Roman"/>
+          <w:sz w:val="26"/>
+          <w:szCs w:val="26"/>
+        </w:rPr>
+        <w:t xml:space="preserve"> </w:t>
+      </w:r>
+    </w:p>
+    <w:p>
+      <w:pPr>
+        <w:pStyle w:val="oancuaDanhsach"/>
+        <w:numPr>
+          <w:ilvl w:val="0"/>
+          <w:numId w:val="22"/>
+        </w:numPr>
+        <w:rPr>
+          <w:rFonts w:ascii="Times New Roman" w:hAnsi="Times New Roman" w:cs="Times New Roman"/>
+          <w:sz w:val="26"/>
+          <w:szCs w:val="26"/>
+        </w:rPr>
+      </w:pPr>
+      <w:r>
+        <w:rPr>
+          <w:rFonts w:ascii="Times New Roman" w:hAnsi="Times New Roman" w:cs="Times New Roman"/>
+          <w:sz w:val="26"/>
+          <w:szCs w:val="26"/>
+        </w:rPr>
+        <w:t xml:space="preserve">Logic </w:t>
+      </w:r>
+      <w:r>
+        <w:rPr>
+          <w:rFonts w:ascii="Times New Roman" w:hAnsi="Times New Roman" w:cs="Times New Roman"/>
+          <w:sz w:val="26"/>
+          <w:szCs w:val="26"/>
+        </w:rPr>
+        <w:t>bị phân tán ở nhiều hàm khác nhau;</w:t>
+      </w:r>
+    </w:p>
+    <w:p>
+      <w:pPr>
+        <w:pStyle w:val="oancuaDanhsach"/>
+        <w:numPr>
+          <w:ilvl w:val="0"/>
+          <w:numId w:val="22"/>
+        </w:numPr>
+        <w:rPr>
+          <w:rFonts w:ascii="Times New Roman" w:hAnsi="Times New Roman" w:cs="Times New Roman"/>
+          <w:sz w:val="26"/>
+          <w:szCs w:val="26"/>
+        </w:rPr>
+      </w:pPr>
+      <w:r>
+        <w:rPr>
+          <w:rFonts w:ascii="Times New Roman" w:hAnsi="Times New Roman" w:cs="Times New Roman"/>
+          <w:sz w:val="26"/>
+          <w:szCs w:val="26"/>
+        </w:rPr>
+        <w:t xml:space="preserve">Dễ </w:t>
+      </w:r>
+      <w:r>
+        <w:rPr>
+          <w:rFonts w:ascii="Times New Roman" w:hAnsi="Times New Roman" w:cs="Times New Roman"/>
+          <w:sz w:val="26"/>
+          <w:szCs w:val="26"/>
+        </w:rPr>
+        <w:t>phát sinh lỗi khi refactor;</w:t>
+      </w:r>
+    </w:p>
+    <w:p>
+      <w:pPr>
+        <w:pStyle w:val="oancuaDanhsach"/>
+        <w:numPr>
+          <w:ilvl w:val="0"/>
+          <w:numId w:val="22"/>
+        </w:numPr>
+        <w:rPr>
+          <w:rFonts w:ascii="Times New Roman" w:hAnsi="Times New Roman" w:cs="Times New Roman"/>
+          <w:sz w:val="26"/>
+          <w:szCs w:val="26"/>
+        </w:rPr>
+      </w:pPr>
+      <w:r>
+        <w:rPr>
+          <w:rFonts w:ascii="Times New Roman" w:hAnsi="Times New Roman" w:cs="Times New Roman"/>
+          <w:sz w:val="26"/>
+          <w:szCs w:val="26"/>
+        </w:rPr>
+        <w:t>Developer mới có thể vô tình bỏ sót một bước quan trọng.</w:t>
+      </w:r>
+      <w:r>
+        <w:rPr>
+          <w:rFonts w:ascii="Times New Roman" w:hAnsi="Times New Roman" w:cs="Times New Roman"/>
+          <w:sz w:val="26"/>
+          <w:szCs w:val="26"/>
+        </w:rPr>
+        <w:t xml:space="preserve"> </w:t>
+      </w:r>
+    </w:p>
+    <w:p>
+      <w:pPr>
+        <w:rPr>
+          <w:rFonts w:ascii="Times New Roman" w:hAnsi="Times New Roman" w:cs="Times New Roman"/>
+          <w:sz w:val="26"/>
+          <w:szCs w:val="26"/>
+        </w:rPr>
+      </w:pPr>
+      <w:r>
+        <w:rPr>
+          <w:rFonts w:ascii="Times New Roman" w:hAnsi="Times New Roman" w:cs="Times New Roman"/>
+          <w:sz w:val="26"/>
+          <w:szCs w:val="26"/>
+        </w:rPr>
+        <w:t>‘</w:t>
+      </w:r>
+      <w:r>
+        <w:rPr>
+          <w:rFonts w:ascii="Times New Roman" w:hAnsi="Times New Roman" w:cs="Times New Roman"/>
+          <w:sz w:val="26"/>
+          <w:szCs w:val="26"/>
+        </w:rPr>
+        <w:t>LockSeats()</w:t>
+      </w:r>
+    </w:p>
+    <w:p>
+      <w:pPr>
+        <w:rPr>
+          <w:rFonts w:ascii="Times New Roman" w:hAnsi="Times New Roman" w:cs="Times New Roman"/>
+          <w:sz w:val="26"/>
+          <w:szCs w:val="26"/>
+        </w:rPr>
+      </w:pPr>
+      <w:r>
+        <w:rPr>
+          <w:rFonts w:ascii="Times New Roman" w:hAnsi="Times New Roman" w:cs="Times New Roman"/>
+          <w:sz w:val="26"/>
+          <w:szCs w:val="26"/>
+        </w:rPr>
+        <w:t>CountSeatsForUpdate()</w:t>
+      </w:r>
+    </w:p>
+    <w:p>
+      <w:pPr>
+        <w:rPr>
+          <w:rFonts w:ascii="Times New Roman" w:hAnsi="Times New Roman" w:cs="Times New Roman"/>
+          <w:sz w:val="26"/>
+          <w:szCs w:val="26"/>
+        </w:rPr>
+      </w:pPr>
+      <w:r>
+        <w:rPr>
+          <w:rFonts w:ascii="Times New Roman" w:hAnsi="Times New Roman" w:cs="Times New Roman"/>
+          <w:sz w:val="26"/>
+          <w:szCs w:val="26"/>
+        </w:rPr>
+        <w:t>BookSeats()</w:t>
+      </w:r>
+    </w:p>
+    <w:p>
+      <w:pPr>
+        <w:rPr>
+          <w:rFonts w:ascii="Times New Roman" w:hAnsi="Times New Roman" w:cs="Times New Roman"/>
+          <w:sz w:val="26"/>
+          <w:szCs w:val="26"/>
+        </w:rPr>
+      </w:pPr>
+      <w:r>
+        <w:rPr>
+          <w:rFonts w:ascii="Times New Roman" w:hAnsi="Times New Roman" w:cs="Times New Roman"/>
+          <w:sz w:val="26"/>
+          <w:szCs w:val="26"/>
+        </w:rPr>
+        <w:t>CreateBooking()</w:t>
+      </w:r>
+      <w:r>
+        <w:rPr>
+          <w:rFonts w:ascii="Times New Roman" w:hAnsi="Times New Roman" w:cs="Times New Roman"/>
+          <w:sz w:val="26"/>
+          <w:szCs w:val="26"/>
+        </w:rPr>
+        <w:t>’</w:t>
+      </w:r>
+    </w:p>
+    <w:p>
+      <w:pPr>
+        <w:rPr>
+          <w:rFonts w:ascii="Times New Roman" w:hAnsi="Times New Roman" w:cs="Times New Roman"/>
+          <w:sz w:val="26"/>
+          <w:szCs w:val="26"/>
+        </w:rPr>
+      </w:pPr>
+      <w:r>
+        <w:rPr>
+          <w:rFonts w:ascii="Times New Roman" w:hAnsi="Times New Roman" w:cs="Times New Roman"/>
+          <w:sz w:val="26"/>
+          <w:szCs w:val="26"/>
+        </w:rPr>
+        <w:t xml:space="preserve">Giải pháp: Đưa </w:t>
+      </w:r>
+      <w:r>
+        <w:rPr>
+          <w:rFonts w:ascii="Times New Roman" w:hAnsi="Times New Roman" w:cs="Times New Roman"/>
+          <w:sz w:val="26"/>
+          <w:szCs w:val="26"/>
+        </w:rPr>
+        <w:t>invariant xuống Database</w:t>
+      </w:r>
+    </w:p>
+    <w:p>
+      <w:pPr>
+        <w:rPr>
+          <w:rFonts w:ascii="Times New Roman" w:hAnsi="Times New Roman" w:cs="Times New Roman"/>
+          <w:b/>
+          <w:bCs/>
+          <w:sz w:val="26"/>
+          <w:szCs w:val="26"/>
+        </w:rPr>
+      </w:pPr>
+      <w:r>
+        <w:rPr>
+          <w:rFonts w:ascii="Times New Roman" w:hAnsi="Times New Roman" w:cs="Times New Roman"/>
+          <w:sz w:val="26"/>
+          <w:szCs w:val="26"/>
+        </w:rPr>
+        <w:t xml:space="preserve">Để khắc phục các vấn đề trên, toàn bộ logic liên quan đến </w:t>
+      </w:r>
+      <w:r>
+        <w:rPr>
+          <w:rFonts w:ascii="Times New Roman" w:hAnsi="Times New Roman" w:cs="Times New Roman"/>
+          <w:b/>
+          <w:bCs/>
+          <w:sz w:val="26"/>
+          <w:szCs w:val="26"/>
+        </w:rPr>
+        <w:t>đặt ghế đồng thời</w:t>
+      </w:r>
+      <w:r>
+        <w:rPr>
+          <w:rFonts w:ascii="Times New Roman" w:hAnsi="Times New Roman" w:cs="Times New Roman"/>
+          <w:sz w:val="26"/>
+          <w:szCs w:val="26"/>
+        </w:rPr>
+        <w:t xml:space="preserve"> được chuyển xuống </w:t>
+      </w:r>
+      <w:r>
+        <w:rPr>
+          <w:rFonts w:ascii="Times New Roman" w:hAnsi="Times New Roman" w:cs="Times New Roman"/>
+          <w:b/>
+          <w:bCs/>
+          <w:sz w:val="26"/>
+          <w:szCs w:val="26"/>
+        </w:rPr>
+        <w:t>Database Management System (DBMS)</w:t>
+      </w:r>
+      <w:r>
+        <w:rPr>
+          <w:rFonts w:ascii="Times New Roman" w:hAnsi="Times New Roman" w:cs="Times New Roman"/>
+          <w:sz w:val="26"/>
+          <w:szCs w:val="26"/>
+        </w:rPr>
+        <w:t xml:space="preserve"> thông qua </w:t>
+      </w:r>
+      <w:r>
+        <w:rPr>
+          <w:rFonts w:ascii="Times New Roman" w:hAnsi="Times New Roman" w:cs="Times New Roman"/>
+          <w:b/>
+          <w:bCs/>
+          <w:sz w:val="26"/>
+          <w:szCs w:val="26"/>
+        </w:rPr>
+        <w:t>stored function</w:t>
+      </w:r>
+    </w:p>
+    <w:p>
+      <w:pPr>
+        <w:rPr>
+          <w:rFonts w:ascii="Times New Roman" w:hAnsi="Times New Roman" w:cs="Times New Roman"/>
+          <w:sz w:val="26"/>
+          <w:szCs w:val="26"/>
+        </w:rPr>
+      </w:pPr>
+      <w:r>
+        <w:rPr>
+          <w:rFonts w:ascii="Times New Roman" w:hAnsi="Times New Roman" w:cs="Times New Roman"/>
+          <w:sz w:val="26"/>
+          <w:szCs w:val="26"/>
+        </w:rPr>
+        <w:t xml:space="preserve">Điều này giúp đảm bảo các </w:t>
+      </w:r>
+      <w:r>
+        <w:rPr>
+          <w:rFonts w:ascii="Times New Roman" w:hAnsi="Times New Roman" w:cs="Times New Roman"/>
+          <w:b/>
+          <w:bCs/>
+          <w:sz w:val="26"/>
+          <w:szCs w:val="26"/>
+        </w:rPr>
+        <w:t>ràng buộc toàn vẹn (data invariants)</w:t>
+      </w:r>
+      <w:r>
+        <w:rPr>
+          <w:rFonts w:ascii="Times New Roman" w:hAnsi="Times New Roman" w:cs="Times New Roman"/>
+          <w:sz w:val="26"/>
+          <w:szCs w:val="26"/>
+        </w:rPr>
+        <w:t xml:space="preserve"> được enforced trực tiếp ở mức database, thay vì phụ thuộc vào logic của ứng dụng.</w:t>
+      </w:r>
+    </w:p>
+    <w:p>
+      <w:pPr>
+        <w:pStyle w:val="oancuaDanhsach"/>
+        <w:numPr>
+          <w:ilvl w:val="0"/>
+          <w:numId w:val="21"/>
+        </w:numPr>
+        <w:rPr>
+          <w:rFonts w:ascii="Times New Roman" w:hAnsi="Times New Roman" w:cs="Times New Roman"/>
+          <w:sz w:val="26"/>
+          <w:szCs w:val="26"/>
+        </w:rPr>
+      </w:pPr>
+      <w:r>
+        <w:rPr>
+          <w:rFonts w:ascii="Times New Roman" w:hAnsi="Times New Roman" w:cs="Times New Roman"/>
+          <w:sz w:val="26"/>
+          <w:szCs w:val="26"/>
+        </w:rPr>
+        <w:t>Ưu điểm:</w:t>
+      </w:r>
+    </w:p>
+    <w:p>
+      <w:pPr>
+        <w:pStyle w:val="oancuaDanhsach"/>
+        <w:numPr>
+          <w:ilvl w:val="1"/>
+          <w:numId w:val="21"/>
+        </w:numPr>
+        <w:rPr>
+          <w:rFonts w:ascii="Times New Roman" w:hAnsi="Times New Roman" w:cs="Times New Roman"/>
+          <w:sz w:val="26"/>
+          <w:szCs w:val="26"/>
+        </w:rPr>
+      </w:pPr>
+      <w:r>
+        <w:rPr>
+          <w:rFonts w:ascii="Times New Roman" w:hAnsi="Times New Roman" w:cs="Times New Roman"/>
+          <w:sz w:val="26"/>
+          <w:szCs w:val="26"/>
+        </w:rPr>
+        <w:t>Atomic tuyệt đối</w:t>
+      </w:r>
+      <w:r>
+        <w:rPr>
+          <w:rFonts w:ascii="Times New Roman" w:hAnsi="Times New Roman" w:cs="Times New Roman"/>
+          <w:sz w:val="26"/>
+          <w:szCs w:val="26"/>
+        </w:rPr>
+        <w:t>: Toàn bộ quá trình đặt ghế diễn ra trong một transaction duy nhất;</w:t>
+      </w:r>
+    </w:p>
+    <w:p>
+      <w:pPr>
+        <w:pStyle w:val="oancuaDanhsach"/>
+        <w:numPr>
+          <w:ilvl w:val="1"/>
+          <w:numId w:val="21"/>
+        </w:numPr>
+        <w:rPr>
+          <w:rFonts w:ascii="Times New Roman" w:hAnsi="Times New Roman" w:cs="Times New Roman"/>
+          <w:sz w:val="26"/>
+          <w:szCs w:val="26"/>
+        </w:rPr>
+      </w:pPr>
+      <w:r>
+        <w:rPr>
+          <w:rFonts w:ascii="Times New Roman" w:hAnsi="Times New Roman" w:cs="Times New Roman"/>
+          <w:sz w:val="26"/>
+          <w:szCs w:val="26"/>
+        </w:rPr>
+        <w:t>Tự động rollback khi xảy ra lỗi, không phụ thuộc vào code phía application;</w:t>
+      </w:r>
+    </w:p>
+    <w:p>
+      <w:pPr>
+        <w:pStyle w:val="oancuaDanhsach"/>
+        <w:numPr>
+          <w:ilvl w:val="1"/>
+          <w:numId w:val="21"/>
+        </w:numPr>
+        <w:rPr>
+          <w:rFonts w:ascii="Times New Roman" w:hAnsi="Times New Roman" w:cs="Times New Roman"/>
+          <w:sz w:val="26"/>
+          <w:szCs w:val="26"/>
+        </w:rPr>
+      </w:pPr>
+      <w:r>
+        <w:rPr>
+          <w:rFonts w:ascii="Times New Roman" w:hAnsi="Times New Roman" w:cs="Times New Roman"/>
+          <w:sz w:val="26"/>
+          <w:szCs w:val="26"/>
+        </w:rPr>
+        <w:t>Invariant nằm trong database</w:t>
+      </w:r>
+      <w:r>
+        <w:rPr>
+          <w:rFonts w:ascii="Times New Roman" w:hAnsi="Times New Roman" w:cs="Times New Roman"/>
+          <w:sz w:val="26"/>
+          <w:szCs w:val="26"/>
+        </w:rPr>
+        <w:t>: Bất kỳ client hay service nào gọi cũng không thể phá vỡ quy tắc;</w:t>
+      </w:r>
+    </w:p>
+    <w:p>
+      <w:pPr>
+        <w:pStyle w:val="oancuaDanhsach"/>
+        <w:numPr>
+          <w:ilvl w:val="1"/>
+          <w:numId w:val="21"/>
+        </w:numPr>
+        <w:rPr>
+          <w:rFonts w:ascii="Times New Roman" w:hAnsi="Times New Roman" w:cs="Times New Roman"/>
+          <w:sz w:val="26"/>
+          <w:szCs w:val="26"/>
+        </w:rPr>
+      </w:pPr>
+      <w:r>
+        <w:rPr>
+          <w:rFonts w:ascii="Times New Roman" w:hAnsi="Times New Roman" w:cs="Times New Roman"/>
+          <w:sz w:val="26"/>
+          <w:szCs w:val="26"/>
+        </w:rPr>
+        <w:t>Loại bỏ race condition do không còn mô hình “check rồi update” rời rạc.</w:t>
+      </w:r>
+    </w:p>
+    <w:p>
+      <w:pPr>
+        <w:pStyle w:val="oancuaDanhsach"/>
+        <w:numPr>
+          <w:ilvl w:val="0"/>
+          <w:numId w:val="23"/>
+        </w:numPr>
+        <w:rPr>
+          <w:rFonts w:ascii="Times New Roman" w:hAnsi="Times New Roman" w:cs="Times New Roman"/>
+          <w:sz w:val="26"/>
+          <w:szCs w:val="26"/>
+        </w:rPr>
+      </w:pPr>
+      <w:r>
+        <w:rPr>
+          <w:rFonts w:ascii="Times New Roman" w:hAnsi="Times New Roman" w:cs="Times New Roman"/>
+          <w:sz w:val="26"/>
+          <w:szCs w:val="26"/>
+        </w:rPr>
+        <w:lastRenderedPageBreak/>
+        <w:t xml:space="preserve">Nhược điểm: </w:t>
+      </w:r>
+    </w:p>
+    <w:p>
+      <w:pPr>
+        <w:pStyle w:val="oancuaDanhsach"/>
+        <w:numPr>
+          <w:ilvl w:val="1"/>
+          <w:numId w:val="23"/>
+        </w:numPr>
+        <w:rPr>
+          <w:rFonts w:ascii="Times New Roman" w:hAnsi="Times New Roman" w:cs="Times New Roman"/>
+          <w:sz w:val="26"/>
+          <w:szCs w:val="26"/>
+        </w:rPr>
+      </w:pPr>
+      <w:r>
+        <w:rPr>
+          <w:rFonts w:ascii="Times New Roman" w:hAnsi="Times New Roman" w:cs="Times New Roman"/>
+          <w:sz w:val="26"/>
+          <w:szCs w:val="26"/>
+        </w:rPr>
+        <w:t>Cần cấu hình và quản lý logic ở mức database;</w:t>
+      </w:r>
+    </w:p>
+    <w:p>
+      <w:pPr>
+        <w:pStyle w:val="oancuaDanhsach"/>
+        <w:numPr>
+          <w:ilvl w:val="1"/>
+          <w:numId w:val="23"/>
+        </w:numPr>
+        <w:rPr>
+          <w:rFonts w:ascii="Times New Roman" w:hAnsi="Times New Roman" w:cs="Times New Roman"/>
+          <w:sz w:val="26"/>
+          <w:szCs w:val="26"/>
+        </w:rPr>
+      </w:pPr>
+      <w:r>
+        <w:rPr>
+          <w:rFonts w:ascii="Times New Roman" w:hAnsi="Times New Roman" w:cs="Times New Roman"/>
+          <w:sz w:val="26"/>
+          <w:szCs w:val="26"/>
+        </w:rPr>
+        <w:t>Yêu cầu developer hiểu rõ transaction, locking và PL/pgSQL.</w:t>
+      </w:r>
+    </w:p>
+    <w:p>
+      <w:pPr>
+        <w:rPr>
+          <w:rFonts w:ascii="Times New Roman" w:hAnsi="Times New Roman" w:cs="Times New Roman"/>
+          <w:sz w:val="26"/>
+          <w:szCs w:val="26"/>
+        </w:rPr>
+      </w:pPr>
+      <w:r>
+        <w:rPr>
+          <w:rFonts w:ascii="Times New Roman" w:hAnsi="Times New Roman" w:cs="Times New Roman"/>
+          <w:sz w:val="26"/>
+          <w:szCs w:val="26"/>
+        </w:rPr>
+        <w:t>‘</w:t>
+      </w:r>
+      <w:r>
+        <w:rPr>
+          <w:rFonts w:ascii="Times New Roman" w:hAnsi="Times New Roman" w:cs="Times New Roman"/>
+          <w:sz w:val="26"/>
+          <w:szCs w:val="26"/>
+        </w:rPr>
+        <w:t>CREATE OR REPLACE FUNCTION book_seats(</w:t>
+      </w:r>
+    </w:p>
+    <w:p>
+      <w:pPr>
+        <w:rPr>
+          <w:rFonts w:ascii="Times New Roman" w:hAnsi="Times New Roman" w:cs="Times New Roman"/>
+          <w:sz w:val="26"/>
+          <w:szCs w:val="26"/>
+        </w:rPr>
+      </w:pPr>
+      <w:r>
+        <w:rPr>
+          <w:rFonts w:ascii="Times New Roman" w:hAnsi="Times New Roman" w:cs="Times New Roman"/>
+          <w:sz w:val="26"/>
+          <w:szCs w:val="26"/>
+        </w:rPr>
+        <w:t xml:space="preserve">    p_user_id bigint,</w:t>
+      </w:r>
+    </w:p>
+    <w:p>
+      <w:pPr>
+        <w:rPr>
+          <w:rFonts w:ascii="Times New Roman" w:hAnsi="Times New Roman" w:cs="Times New Roman"/>
+          <w:sz w:val="26"/>
+          <w:szCs w:val="26"/>
+        </w:rPr>
+      </w:pPr>
+      <w:r>
+        <w:rPr>
+          <w:rFonts w:ascii="Times New Roman" w:hAnsi="Times New Roman" w:cs="Times New Roman"/>
+          <w:sz w:val="26"/>
+          <w:szCs w:val="26"/>
+        </w:rPr>
+        <w:t xml:space="preserve">    p_seat_ids </w:t>
+      </w:r>
+      <w:r>
+        <w:rPr>
+          <w:rFonts w:ascii="Times New Roman" w:hAnsi="Times New Roman" w:cs="Times New Roman"/>
+          <w:sz w:val="26"/>
+          <w:szCs w:val="26"/>
+        </w:rPr>
+        <w:t>big</w:t>
+      </w:r>
+      <w:r>
+        <w:rPr>
+          <w:rFonts w:ascii="Times New Roman" w:hAnsi="Times New Roman" w:cs="Times New Roman"/>
+          <w:sz w:val="26"/>
+          <w:szCs w:val="26"/>
+        </w:rPr>
+        <w:t>int[]</w:t>
+      </w:r>
+    </w:p>
+    <w:p>
+      <w:pPr>
+        <w:rPr>
+          <w:rFonts w:ascii="Times New Roman" w:hAnsi="Times New Roman" w:cs="Times New Roman"/>
+          <w:sz w:val="26"/>
+          <w:szCs w:val="26"/>
+        </w:rPr>
+      </w:pPr>
+      <w:r>
+        <w:rPr>
+          <w:rFonts w:ascii="Times New Roman" w:hAnsi="Times New Roman" w:cs="Times New Roman"/>
+          <w:sz w:val="26"/>
+          <w:szCs w:val="26"/>
+        </w:rPr>
+        <w:t>) RETURNS void AS $$</w:t>
+      </w:r>
+    </w:p>
+    <w:p>
+      <w:pPr>
+        <w:rPr>
+          <w:rFonts w:ascii="Times New Roman" w:hAnsi="Times New Roman" w:cs="Times New Roman"/>
+          <w:sz w:val="26"/>
+          <w:szCs w:val="26"/>
+        </w:rPr>
+      </w:pPr>
+      <w:r>
+        <w:rPr>
+          <w:rFonts w:ascii="Times New Roman" w:hAnsi="Times New Roman" w:cs="Times New Roman"/>
+          <w:sz w:val="26"/>
+          <w:szCs w:val="26"/>
+        </w:rPr>
+        <w:t>DECLARE</w:t>
+      </w:r>
+    </w:p>
+    <w:p>
+      <w:pPr>
+        <w:rPr>
+          <w:rFonts w:ascii="Times New Roman" w:hAnsi="Times New Roman" w:cs="Times New Roman"/>
+          <w:sz w:val="26"/>
+          <w:szCs w:val="26"/>
+        </w:rPr>
+      </w:pPr>
+      <w:r>
+        <w:rPr>
+          <w:rFonts w:ascii="Times New Roman" w:hAnsi="Times New Roman" w:cs="Times New Roman"/>
+          <w:sz w:val="26"/>
+          <w:szCs w:val="26"/>
+        </w:rPr>
+        <w:t xml:space="preserve">    </w:t>
+      </w:r>
+      <w:r>
+        <w:rPr>
+          <w:rFonts w:ascii="Times New Roman" w:hAnsi="Times New Roman" w:cs="Times New Roman"/>
+          <w:sz w:val="26"/>
+          <w:szCs w:val="26"/>
+        </w:rPr>
+        <w:t>p</w:t>
+      </w:r>
+      <w:r>
+        <w:rPr>
+          <w:rFonts w:ascii="Times New Roman" w:hAnsi="Times New Roman" w:cs="Times New Roman"/>
+          <w:sz w:val="26"/>
+          <w:szCs w:val="26"/>
+        </w:rPr>
+        <w:t>_updated_count int;</w:t>
+      </w:r>
+    </w:p>
+    <w:p>
+      <w:pPr>
+        <w:rPr>
+          <w:rFonts w:ascii="Times New Roman" w:hAnsi="Times New Roman" w:cs="Times New Roman"/>
+          <w:sz w:val="26"/>
+          <w:szCs w:val="26"/>
+        </w:rPr>
+      </w:pPr>
+      <w:r>
+        <w:rPr>
+          <w:rFonts w:ascii="Times New Roman" w:hAnsi="Times New Roman" w:cs="Times New Roman"/>
+          <w:sz w:val="26"/>
+          <w:szCs w:val="26"/>
+        </w:rPr>
+        <w:t>BEGIN</w:t>
+      </w:r>
+    </w:p>
+    <w:p>
+      <w:pPr>
+        <w:rPr>
+          <w:rFonts w:ascii="Times New Roman" w:hAnsi="Times New Roman" w:cs="Times New Roman"/>
+          <w:sz w:val="26"/>
+          <w:szCs w:val="26"/>
+        </w:rPr>
+      </w:pPr>
+      <w:r>
+        <w:rPr>
+          <w:rFonts w:ascii="Times New Roman" w:hAnsi="Times New Roman" w:cs="Times New Roman"/>
+          <w:sz w:val="26"/>
+          <w:szCs w:val="26"/>
+        </w:rPr>
+        <w:t xml:space="preserve">    PERFORM 1</w:t>
+      </w:r>
+    </w:p>
+    <w:p>
+      <w:pPr>
+        <w:rPr>
+          <w:rFonts w:ascii="Times New Roman" w:hAnsi="Times New Roman" w:cs="Times New Roman"/>
+          <w:sz w:val="26"/>
+          <w:szCs w:val="26"/>
+        </w:rPr>
+      </w:pPr>
+      <w:r>
+        <w:rPr>
+          <w:rFonts w:ascii="Times New Roman" w:hAnsi="Times New Roman" w:cs="Times New Roman"/>
+          <w:sz w:val="26"/>
+          <w:szCs w:val="26"/>
+        </w:rPr>
+        <w:t xml:space="preserve">    FROM seats</w:t>
+      </w:r>
+    </w:p>
+    <w:p>
+      <w:pPr>
+        <w:rPr>
+          <w:rFonts w:ascii="Times New Roman" w:hAnsi="Times New Roman" w:cs="Times New Roman"/>
+          <w:sz w:val="26"/>
+          <w:szCs w:val="26"/>
+        </w:rPr>
+      </w:pPr>
+      <w:r>
+        <w:rPr>
+          <w:rFonts w:ascii="Times New Roman" w:hAnsi="Times New Roman" w:cs="Times New Roman"/>
+          <w:sz w:val="26"/>
+          <w:szCs w:val="26"/>
+        </w:rPr>
+        <w:t xml:space="preserve">    WHERE seat_id = ANY (p_seat_ids)</w:t>
+      </w:r>
+    </w:p>
+    <w:p>
+      <w:pPr>
+        <w:rPr>
+          <w:rFonts w:ascii="Times New Roman" w:hAnsi="Times New Roman" w:cs="Times New Roman"/>
+          <w:sz w:val="26"/>
+          <w:szCs w:val="26"/>
+        </w:rPr>
+      </w:pPr>
+      <w:r>
+        <w:rPr>
+          <w:rFonts w:ascii="Times New Roman" w:hAnsi="Times New Roman" w:cs="Times New Roman"/>
+          <w:sz w:val="26"/>
+          <w:szCs w:val="26"/>
+        </w:rPr>
+        <w:t xml:space="preserve">    FOR UPDATE;</w:t>
+      </w:r>
+    </w:p>
+    <w:p>
+      <w:pPr>
+        <w:rPr>
+          <w:rFonts w:ascii="Times New Roman" w:hAnsi="Times New Roman" w:cs="Times New Roman"/>
+          <w:sz w:val="26"/>
+          <w:szCs w:val="26"/>
+        </w:rPr>
+      </w:pPr>
+    </w:p>
+    <w:p>
+      <w:pPr>
+        <w:rPr>
+          <w:rFonts w:ascii="Times New Roman" w:hAnsi="Times New Roman" w:cs="Times New Roman"/>
+          <w:sz w:val="26"/>
+          <w:szCs w:val="26"/>
+        </w:rPr>
+      </w:pPr>
+      <w:r>
+        <w:rPr>
+          <w:rFonts w:ascii="Times New Roman" w:hAnsi="Times New Roman" w:cs="Times New Roman"/>
+          <w:sz w:val="26"/>
+          <w:szCs w:val="26"/>
+        </w:rPr>
+        <w:t xml:space="preserve">    UPDATE seats</w:t>
+      </w:r>
+    </w:p>
+    <w:p>
+      <w:pPr>
+        <w:rPr>
+          <w:rFonts w:ascii="Times New Roman" w:hAnsi="Times New Roman" w:cs="Times New Roman"/>
+          <w:sz w:val="26"/>
+          <w:szCs w:val="26"/>
+        </w:rPr>
+      </w:pPr>
+      <w:r>
+        <w:rPr>
+          <w:rFonts w:ascii="Times New Roman" w:hAnsi="Times New Roman" w:cs="Times New Roman"/>
+          <w:sz w:val="26"/>
+          <w:szCs w:val="26"/>
+        </w:rPr>
+        <w:t xml:space="preserve">    SET status = 'booked'</w:t>
+      </w:r>
+    </w:p>
+    <w:p>
+      <w:pPr>
+        <w:rPr>
+          <w:rFonts w:ascii="Times New Roman" w:hAnsi="Times New Roman" w:cs="Times New Roman"/>
+          <w:sz w:val="26"/>
+          <w:szCs w:val="26"/>
+        </w:rPr>
+      </w:pPr>
+      <w:r>
+        <w:rPr>
+          <w:rFonts w:ascii="Times New Roman" w:hAnsi="Times New Roman" w:cs="Times New Roman"/>
+          <w:sz w:val="26"/>
+          <w:szCs w:val="26"/>
+        </w:rPr>
+        <w:t xml:space="preserve">    WHERE seat_id = ANY (p_seat_ids)</w:t>
+      </w:r>
+    </w:p>
+    <w:p>
+      <w:pPr>
+        <w:rPr>
+          <w:rFonts w:ascii="Times New Roman" w:hAnsi="Times New Roman" w:cs="Times New Roman"/>
+          <w:sz w:val="26"/>
+          <w:szCs w:val="26"/>
+        </w:rPr>
+      </w:pPr>
+      <w:r>
+        <w:rPr>
+          <w:rFonts w:ascii="Times New Roman" w:hAnsi="Times New Roman" w:cs="Times New Roman"/>
+          <w:sz w:val="26"/>
+          <w:szCs w:val="26"/>
+        </w:rPr>
+        <w:t xml:space="preserve">      AND status = 'available';</w:t>
+      </w:r>
+    </w:p>
+    <w:p>
+      <w:pPr>
+        <w:rPr>
+          <w:rFonts w:ascii="Times New Roman" w:hAnsi="Times New Roman" w:cs="Times New Roman"/>
+          <w:sz w:val="26"/>
+          <w:szCs w:val="26"/>
+        </w:rPr>
+      </w:pPr>
+    </w:p>
+    <w:p>
+      <w:pPr>
+        <w:rPr>
+          <w:rFonts w:ascii="Times New Roman" w:hAnsi="Times New Roman" w:cs="Times New Roman"/>
+          <w:sz w:val="26"/>
+          <w:szCs w:val="26"/>
+        </w:rPr>
+      </w:pPr>
+      <w:r>
+        <w:rPr>
+          <w:rFonts w:ascii="Times New Roman" w:hAnsi="Times New Roman" w:cs="Times New Roman"/>
+          <w:sz w:val="26"/>
+          <w:szCs w:val="26"/>
+        </w:rPr>
+        <w:t xml:space="preserve">    GET DIAGNOSTICS </w:t>
+      </w:r>
+      <w:r>
+        <w:rPr>
+          <w:rFonts w:ascii="Times New Roman" w:hAnsi="Times New Roman" w:cs="Times New Roman"/>
+          <w:sz w:val="26"/>
+          <w:szCs w:val="26"/>
+        </w:rPr>
+        <w:t>p</w:t>
+      </w:r>
+      <w:r>
+        <w:rPr>
+          <w:rFonts w:ascii="Times New Roman" w:hAnsi="Times New Roman" w:cs="Times New Roman"/>
+          <w:sz w:val="26"/>
+          <w:szCs w:val="26"/>
+        </w:rPr>
+        <w:t>_updated_count = ROW_COUNT;</w:t>
+      </w:r>
+    </w:p>
+    <w:p>
+      <w:pPr>
+        <w:rPr>
+          <w:rFonts w:ascii="Times New Roman" w:hAnsi="Times New Roman" w:cs="Times New Roman"/>
+          <w:sz w:val="26"/>
+          <w:szCs w:val="26"/>
+        </w:rPr>
+      </w:pPr>
+    </w:p>
+    <w:p>
+      <w:pPr>
+        <w:rPr>
+          <w:rFonts w:ascii="Times New Roman" w:hAnsi="Times New Roman" w:cs="Times New Roman"/>
+          <w:sz w:val="26"/>
+          <w:szCs w:val="26"/>
+        </w:rPr>
+      </w:pPr>
+      <w:r>
+        <w:rPr>
+          <w:rFonts w:ascii="Times New Roman" w:hAnsi="Times New Roman" w:cs="Times New Roman"/>
+          <w:sz w:val="26"/>
+          <w:szCs w:val="26"/>
+        </w:rPr>
+        <w:t xml:space="preserve">    IF </w:t>
+      </w:r>
+      <w:r>
+        <w:rPr>
+          <w:rFonts w:ascii="Times New Roman" w:hAnsi="Times New Roman" w:cs="Times New Roman"/>
+          <w:sz w:val="26"/>
+          <w:szCs w:val="26"/>
+        </w:rPr>
+        <w:t>p</w:t>
+      </w:r>
+      <w:r>
+        <w:rPr>
+          <w:rFonts w:ascii="Times New Roman" w:hAnsi="Times New Roman" w:cs="Times New Roman"/>
+          <w:sz w:val="26"/>
+          <w:szCs w:val="26"/>
+        </w:rPr>
+        <w:t>_updated_count &lt;&gt; array_length(p_seat_ids, 1) THEN</w:t>
+      </w:r>
+    </w:p>
+    <w:p>
+      <w:pPr>
+        <w:rPr>
+          <w:rFonts w:ascii="Times New Roman" w:hAnsi="Times New Roman" w:cs="Times New Roman"/>
+          <w:sz w:val="26"/>
+          <w:szCs w:val="26"/>
+        </w:rPr>
+      </w:pPr>
+      <w:r>
+        <w:rPr>
+          <w:rFonts w:ascii="Times New Roman" w:hAnsi="Times New Roman" w:cs="Times New Roman"/>
+          <w:sz w:val="26"/>
+          <w:szCs w:val="26"/>
+        </w:rPr>
+        <w:t xml:space="preserve">        RAISE EXCEPTION 'Some seats already booked';</w:t>
+      </w:r>
+    </w:p>
+    <w:p>
+      <w:pPr>
+        <w:rPr>
+          <w:rFonts w:ascii="Times New Roman" w:hAnsi="Times New Roman" w:cs="Times New Roman"/>
+          <w:sz w:val="26"/>
+          <w:szCs w:val="26"/>
+        </w:rPr>
+      </w:pPr>
+      <w:r>
+        <w:rPr>
+          <w:rFonts w:ascii="Times New Roman" w:hAnsi="Times New Roman" w:cs="Times New Roman"/>
+          <w:sz w:val="26"/>
+          <w:szCs w:val="26"/>
+        </w:rPr>
+        <w:t xml:space="preserve">    END IF;</w:t>
+      </w:r>
+    </w:p>
+    <w:p>
+      <w:pPr>
+        <w:rPr>
+          <w:rFonts w:ascii="Times New Roman" w:hAnsi="Times New Roman" w:cs="Times New Roman"/>
+          <w:sz w:val="26"/>
+          <w:szCs w:val="26"/>
+        </w:rPr>
+      </w:pPr>
+    </w:p>
+    <w:p>
+      <w:pPr>
+        <w:rPr>
+          <w:rFonts w:ascii="Times New Roman" w:hAnsi="Times New Roman" w:cs="Times New Roman"/>
+          <w:sz w:val="26"/>
+          <w:szCs w:val="26"/>
+        </w:rPr>
+      </w:pPr>
+      <w:r>
+        <w:rPr>
+          <w:rFonts w:ascii="Times New Roman" w:hAnsi="Times New Roman" w:cs="Times New Roman"/>
+          <w:sz w:val="26"/>
+          <w:szCs w:val="26"/>
+        </w:rPr>
+        <w:t xml:space="preserve">    INSERT INTO bookings(user_id, seat_id)</w:t>
+      </w:r>
+    </w:p>
+    <w:p>
+      <w:pPr>
+        <w:rPr>
+          <w:rFonts w:ascii="Times New Roman" w:hAnsi="Times New Roman" w:cs="Times New Roman"/>
+          <w:sz w:val="26"/>
+          <w:szCs w:val="26"/>
+        </w:rPr>
+      </w:pPr>
+      <w:r>
+        <w:rPr>
+          <w:rFonts w:ascii="Times New Roman" w:hAnsi="Times New Roman" w:cs="Times New Roman"/>
+          <w:sz w:val="26"/>
+          <w:szCs w:val="26"/>
+        </w:rPr>
+        <w:t xml:space="preserve">    SELECT p_user_id, unnest(p_seat_ids);</w:t>
+      </w:r>
+    </w:p>
+    <w:p>
+      <w:pPr>
+        <w:rPr>
+          <w:rFonts w:ascii="Times New Roman" w:hAnsi="Times New Roman" w:cs="Times New Roman"/>
+          <w:sz w:val="26"/>
+          <w:szCs w:val="26"/>
+        </w:rPr>
+      </w:pPr>
+      <w:r>
+        <w:rPr>
+          <w:rFonts w:ascii="Times New Roman" w:hAnsi="Times New Roman" w:cs="Times New Roman"/>
+          <w:sz w:val="26"/>
+          <w:szCs w:val="26"/>
+        </w:rPr>
+        <w:t>END;</w:t>
+      </w:r>
+    </w:p>
+    <w:p>
+      <w:pPr>
+        <w:rPr>
+          <w:rFonts w:ascii="Times New Roman" w:hAnsi="Times New Roman" w:cs="Times New Roman"/>
+          <w:sz w:val="26"/>
+          <w:szCs w:val="26"/>
+        </w:rPr>
+      </w:pPr>
+      <w:r>
+        <w:rPr>
+          <w:rFonts w:ascii="Times New Roman" w:hAnsi="Times New Roman" w:cs="Times New Roman"/>
+          <w:sz w:val="26"/>
+          <w:szCs w:val="26"/>
+        </w:rPr>
+        <w:lastRenderedPageBreak/>
+        <w:t>$$ LANGUAGE plpgsql;</w:t>
+      </w:r>
+      <w:r>
+        <w:rPr>
+          <w:rFonts w:ascii="Times New Roman" w:hAnsi="Times New Roman" w:cs="Times New Roman"/>
+          <w:sz w:val="26"/>
+          <w:szCs w:val="26"/>
+        </w:rPr>
+        <w:t>’</w:t>
+      </w:r>
+    </w:p>
+    <w:p>
+      <w:pPr>
+        <w:rPr>
+          <w:rFonts w:ascii="Times New Roman" w:hAnsi="Times New Roman" w:cs="Times New Roman"/>
+          <w:sz w:val="26"/>
+          <w:szCs w:val="26"/>
+        </w:rPr>
+      </w:pPr>
+      <w:r>
+        <w:rPr>
+          <w:rFonts w:ascii="Times New Roman" w:hAnsi="Times New Roman" w:cs="Times New Roman"/>
+          <w:sz w:val="26"/>
+          <w:szCs w:val="26"/>
+        </w:rPr>
         <w:t>4) Redis</w:t>
       </w:r>
     </w:p>
@@ -916,15 +2021,7 @@
           <w:sz w:val="26"/>
           <w:szCs w:val="26"/>
         </w:rPr>
-        <w:t xml:space="preserve">Rate </w:t>
-      </w:r>
-      <w:r>
-        <w:rPr>
-          <w:rFonts w:ascii="Times New Roman" w:hAnsi="Times New Roman" w:cs="Times New Roman"/>
-          <w:sz w:val="26"/>
-          <w:szCs w:val="26"/>
-        </w:rPr>
-        <w:t>Limiting.</w:t>
+        <w:t>Rate Limiting.</w:t>
       </w:r>
     </w:p>
     <w:p>
@@ -974,15 +2071,7 @@
           <w:sz w:val="26"/>
           <w:szCs w:val="26"/>
         </w:rPr>
-        <w:t>Rate Limiting</w:t>
-      </w:r>
-      <w:r>
-        <w:rPr>
-          <w:rFonts w:ascii="Times New Roman" w:hAnsi="Times New Roman" w:cs="Times New Roman"/>
-          <w:sz w:val="26"/>
-          <w:szCs w:val="26"/>
-        </w:rPr>
-        <w:t xml:space="preserve"> </w:t>
+        <w:t xml:space="preserve">Rate Limiting </w:t>
       </w:r>
       <w:r>
         <w:rPr>
@@ -1498,23 +2587,7 @@
           <w:sz w:val="26"/>
           <w:szCs w:val="26"/>
         </w:rPr>
-        <w:t xml:space="preserve"> kết hợp thêm Refresh Token và kỹ thuật </w:t>
-      </w:r>
-      <w:r>
-        <w:rPr>
-          <w:rFonts w:ascii="Times New Roman" w:hAnsi="Times New Roman" w:cs="Times New Roman"/>
-          <w:sz w:val="26"/>
-          <w:szCs w:val="26"/>
-        </w:rPr>
-        <w:t>Refresh Token</w:t>
-      </w:r>
-      <w:r>
-        <w:rPr>
-          <w:rFonts w:ascii="Times New Roman" w:hAnsi="Times New Roman" w:cs="Times New Roman"/>
-          <w:sz w:val="26"/>
-          <w:szCs w:val="26"/>
-        </w:rPr>
-        <w:t xml:space="preserve"> </w:t>
+        <w:t xml:space="preserve"> kết hợp thêm Refresh Token và kỹ thuật Refresh Token </w:t>
       </w:r>
       <w:r>
         <w:rPr>
@@ -1547,6 +2620,7 @@
           <w:sz w:val="26"/>
           <w:szCs w:val="26"/>
         </w:rPr>
+        <w:lastRenderedPageBreak/>
         <w:t xml:space="preserve">Nếu không có Refresh Token, hệ thống buộc phải để thời gian sống của Access Token rất dài (ví dụ 7 ngày) để người dùng không phải đăng nhập lại liên tục. </w:t>
       </w:r>
       <w:r>
@@ -1571,23 +2645,7 @@
           <w:sz w:val="26"/>
           <w:szCs w:val="26"/>
         </w:rPr>
-        <w:t> không có cách nào ngăn chặn.</w:t>
-      </w:r>
-      <w:r>
-        <w:rPr>
-          <w:rFonts w:ascii="Times New Roman" w:hAnsi="Times New Roman" w:cs="Times New Roman"/>
-          <w:sz w:val="26"/>
-          <w:szCs w:val="26"/>
-        </w:rPr>
-        <w:t xml:space="preserve"> </w:t>
-      </w:r>
-      <w:r>
-        <w:rPr>
-          <w:rFonts w:ascii="Times New Roman" w:hAnsi="Times New Roman" w:cs="Times New Roman"/>
-          <w:sz w:val="26"/>
-          <w:szCs w:val="26"/>
-        </w:rPr>
-        <w:t xml:space="preserve">Khi có Refresh Token, </w:t>
+        <w:t xml:space="preserve"> không có cách nào ngăn chặn. Khi có Refresh Token, </w:t>
       </w:r>
       <w:r>
         <w:rPr>
@@ -1690,39 +2748,7 @@
           <w:sz w:val="26"/>
           <w:szCs w:val="26"/>
         </w:rPr>
-        <w:t xml:space="preserve">Phát hiện chiếm đoạt tài </w:t>
-      </w:r>
-      <w:r>
-        <w:rPr>
-          <w:rFonts w:ascii="Times New Roman" w:hAnsi="Times New Roman" w:cs="Times New Roman"/>
-          <w:sz w:val="26"/>
-          <w:szCs w:val="26"/>
-        </w:rPr>
-        <w:t xml:space="preserve">khoản: </w:t>
-      </w:r>
-      <w:r>
-        <w:rPr>
-          <w:rFonts w:ascii="Times New Roman" w:hAnsi="Times New Roman" w:cs="Times New Roman"/>
-          <w:sz w:val="26"/>
-          <w:szCs w:val="26"/>
-        </w:rPr>
-        <w:t xml:space="preserve">Nếu một hacker đánh cắp được refresh_token của </w:t>
-      </w:r>
-      <w:r>
-        <w:rPr>
-          <w:rFonts w:ascii="Times New Roman" w:hAnsi="Times New Roman" w:cs="Times New Roman"/>
-          <w:sz w:val="26"/>
-          <w:szCs w:val="26"/>
-        </w:rPr>
-        <w:t>người dùng</w:t>
-      </w:r>
-      <w:r>
-        <w:rPr>
-          <w:rFonts w:ascii="Times New Roman" w:hAnsi="Times New Roman" w:cs="Times New Roman"/>
-          <w:sz w:val="26"/>
-          <w:szCs w:val="26"/>
-        </w:rPr>
-        <w:t xml:space="preserve"> và sử dụng nó trước, khi người dùng thật dùng lại cái token đó, Server sẽ nhận thấy token này đã được sử dụng </w:t>
+        <w:t xml:space="preserve">Phát hiện chiếm đoạt tài khoản: Nếu một hacker đánh cắp được refresh_token của người dùng và sử dụng nó trước, khi người dùng thật dùng lại cái token đó, Server sẽ nhận thấy token này đã được sử dụng </w:t>
       </w:r>
       <w:r>
         <w:rPr>
@@ -1752,39 +2778,7 @@
           <w:sz w:val="26"/>
           <w:szCs w:val="26"/>
         </w:rPr>
-        <w:t xml:space="preserve">Cơ chế tự </w:t>
-      </w:r>
-      <w:r>
-        <w:rPr>
-          <w:rFonts w:ascii="Times New Roman" w:hAnsi="Times New Roman" w:cs="Times New Roman"/>
-          <w:sz w:val="26"/>
-          <w:szCs w:val="26"/>
-        </w:rPr>
-        <w:t xml:space="preserve">hủy: </w:t>
-      </w:r>
-      <w:r>
-        <w:rPr>
-          <w:rFonts w:ascii="Times New Roman" w:hAnsi="Times New Roman" w:cs="Times New Roman"/>
-          <w:sz w:val="26"/>
-          <w:szCs w:val="26"/>
-        </w:rPr>
-        <w:t>Ngay khi phát hiện một token cũ bị sử dụng lại</w:t>
-      </w:r>
-      <w:r>
-        <w:rPr>
-          <w:rFonts w:ascii="Times New Roman" w:hAnsi="Times New Roman" w:cs="Times New Roman"/>
-          <w:sz w:val="26"/>
-          <w:szCs w:val="26"/>
-        </w:rPr>
-        <w:t xml:space="preserve"> ở bước trên</w:t>
-      </w:r>
-      <w:r>
-        <w:rPr>
-          <w:rFonts w:ascii="Times New Roman" w:hAnsi="Times New Roman" w:cs="Times New Roman"/>
-          <w:sz w:val="26"/>
-          <w:szCs w:val="26"/>
-        </w:rPr>
-        <w:t xml:space="preserve">, hệ thống sẽ vô hiệu hóa tất cả các token đang hoạt động của người dùng đó, buộc phải đăng nhập lại. Điều này ngăn chặn hacker tiếp tục trục </w:t>
+        <w:t xml:space="preserve">Cơ chế tự hủy: Ngay khi phát hiện một token cũ bị sử dụng lại ở bước trên, hệ thống sẽ vô hiệu hóa tất cả các token đang hoạt động của người dùng đó, buộc phải đăng nhập lại. Điều này ngăn chặn hacker tiếp tục trục </w:t>
       </w:r>
       <w:r>
         <w:rPr>
@@ -1814,23 +2808,7 @@
           <w:sz w:val="26"/>
           <w:szCs w:val="26"/>
         </w:rPr>
-        <w:t>Hạn chế thời gian sống của Token: Thay vì một refresh_token có hạn 7 ngày, mỗi lần "</w:t>
-      </w:r>
-      <w:r>
-        <w:rPr>
-          <w:rFonts w:ascii="Times New Roman" w:hAnsi="Times New Roman" w:cs="Times New Roman"/>
-          <w:sz w:val="26"/>
-          <w:szCs w:val="26"/>
-        </w:rPr>
-        <w:t>rotate</w:t>
-      </w:r>
-      <w:r>
-        <w:rPr>
-          <w:rFonts w:ascii="Times New Roman" w:hAnsi="Times New Roman" w:cs="Times New Roman"/>
-          <w:sz w:val="26"/>
-          <w:szCs w:val="26"/>
-        </w:rPr>
-        <w:t>", kẻ trộm chỉ có một khoảng thời gian cực ngắn để sử dụng trước khi nó trở nên vô dụng.</w:t>
+        <w:t>Hạn chế thời gian sống của Token: Thay vì một refresh_token có hạn 7 ngày, mỗi lần "rotate", kẻ trộm chỉ có một khoảng thời gian cực ngắn để sử dụng trước khi nó trở nên vô dụng.</w:t>
       </w:r>
     </w:p>
     <w:p>
@@ -2061,6 +3039,7 @@
           <w:sz w:val="26"/>
           <w:szCs w:val="26"/>
         </w:rPr>
+        <w:lastRenderedPageBreak/>
         <w:t>JWT được dùng để:</w:t>
       </w:r>
     </w:p>
@@ -2143,15 +3122,7 @@
           <w:sz w:val="26"/>
           <w:szCs w:val="26"/>
         </w:rPr>
-        <w:t>Kiểm soát</w:t>
-      </w:r>
-      <w:r>
-        <w:rPr>
-          <w:rFonts w:ascii="Times New Roman" w:hAnsi="Times New Roman" w:cs="Times New Roman"/>
-          <w:sz w:val="26"/>
-          <w:szCs w:val="26"/>
-        </w:rPr>
-        <w:t xml:space="preserve"> quyền truy cập giữa API công khai và API yêu cầu đăng </w:t>
+        <w:t xml:space="preserve">Kiểm soát quyền truy cập giữa API công khai và API yêu cầu đăng </w:t>
       </w:r>
       <w:r>
         <w:rPr>
@@ -2657,7 +3628,6 @@
           <w:sz w:val="26"/>
           <w:szCs w:val="26"/>
         </w:rPr>
-        <w:lastRenderedPageBreak/>
         <w:t>Phân quyền nâng cao (admin, staff)</w:t>
       </w:r>
       <w:r>
@@ -3442,6 +4412,119 @@
     </w:lvl>
   </w:abstractNum>
   <w:abstractNum w:abstractNumId="5" w15:restartNumberingAfterBreak="0">
+    <w:nsid w:val="15AD36FD"/>
+    <w:multiLevelType w:val="hybridMultilevel"/>
+    <w:tmpl w:val="9D30D34C"/>
+    <w:lvl w:ilvl="0" w:tplc="992A8E5C">
+      <w:start w:val="1"/>
+      <w:numFmt w:val="bullet"/>
+      <w:lvlText w:val=""/>
+      <w:lvlJc w:val="left"/>
+      <w:pPr>
+        <w:ind w:left="720" w:hanging="360"/>
+      </w:pPr>
+      <w:rPr>
+        <w:rFonts w:ascii="Symbol" w:hAnsi="Symbol" w:hint="default"/>
+      </w:rPr>
+    </w:lvl>
+    <w:lvl w:ilvl="1" w:tplc="042A0001">
+      <w:start w:val="1"/>
+      <w:numFmt w:val="bullet"/>
+      <w:lvlText w:val=""/>
+      <w:lvlJc w:val="left"/>
+      <w:pPr>
+        <w:ind w:left="1070" w:hanging="360"/>
+      </w:pPr>
+      <w:rPr>
+        <w:rFonts w:ascii="Symbol" w:hAnsi="Symbol" w:hint="default"/>
+      </w:rPr>
+    </w:lvl>
+    <w:lvl w:ilvl="2" w:tplc="042A0005" w:tentative="1">
+      <w:start w:val="1"/>
+      <w:numFmt w:val="bullet"/>
+      <w:lvlText w:val=""/>
+      <w:lvlJc w:val="left"/>
+      <w:pPr>
+        <w:ind w:left="2160" w:hanging="360"/>
+      </w:pPr>
+      <w:rPr>
+        <w:rFonts w:ascii="Wingdings" w:hAnsi="Wingdings" w:hint="default"/>
+      </w:rPr>
+    </w:lvl>
+    <w:lvl w:ilvl="3" w:tplc="042A0001" w:tentative="1">
+      <w:start w:val="1"/>
+      <w:numFmt w:val="bullet"/>
+      <w:lvlText w:val=""/>
+      <w:lvlJc w:val="left"/>
+      <w:pPr>
+        <w:ind w:left="2880" w:hanging="360"/>
+      </w:pPr>
+      <w:rPr>
+        <w:rFonts w:ascii="Symbol" w:hAnsi="Symbol" w:hint="default"/>
+      </w:rPr>
+    </w:lvl>
+    <w:lvl w:ilvl="4" w:tplc="042A0003" w:tentative="1">
+      <w:start w:val="1"/>
+      <w:numFmt w:val="bullet"/>
+      <w:lvlText w:val="o"/>
+      <w:lvlJc w:val="left"/>
+      <w:pPr>
+        <w:ind w:left="3600" w:hanging="360"/>
+      </w:pPr>
+      <w:rPr>
+        <w:rFonts w:ascii="Courier New" w:hAnsi="Courier New" w:cs="Courier New" w:hint="default"/>
+      </w:rPr>
+    </w:lvl>
+    <w:lvl w:ilvl="5" w:tplc="042A0005" w:tentative="1">
+      <w:start w:val="1"/>
+      <w:numFmt w:val="bullet"/>
+      <w:lvlText w:val=""/>
+      <w:lvlJc w:val="left"/>
+      <w:pPr>
+        <w:ind w:left="4320" w:hanging="360"/>
+      </w:pPr>
+      <w:rPr>
+        <w:rFonts w:ascii="Wingdings" w:hAnsi="Wingdings" w:hint="default"/>
+      </w:rPr>
+    </w:lvl>
+    <w:lvl w:ilvl="6" w:tplc="042A0001" w:tentative="1">
+      <w:start w:val="1"/>
+      <w:numFmt w:val="bullet"/>
+      <w:lvlText w:val=""/>
+      <w:lvlJc w:val="left"/>
+      <w:pPr>
+        <w:ind w:left="5040" w:hanging="360"/>
+      </w:pPr>
+      <w:rPr>
+        <w:rFonts w:ascii="Symbol" w:hAnsi="Symbol" w:hint="default"/>
+      </w:rPr>
+    </w:lvl>
+    <w:lvl w:ilvl="7" w:tplc="042A0003" w:tentative="1">
+      <w:start w:val="1"/>
+      <w:numFmt w:val="bullet"/>
+      <w:lvlText w:val="o"/>
+      <w:lvlJc w:val="left"/>
+      <w:pPr>
+        <w:ind w:left="5760" w:hanging="360"/>
+      </w:pPr>
+      <w:rPr>
+        <w:rFonts w:ascii="Courier New" w:hAnsi="Courier New" w:cs="Courier New" w:hint="default"/>
+      </w:rPr>
+    </w:lvl>
+    <w:lvl w:ilvl="8" w:tplc="042A0005" w:tentative="1">
+      <w:start w:val="1"/>
+      <w:numFmt w:val="bullet"/>
+      <w:lvlText w:val=""/>
+      <w:lvlJc w:val="left"/>
+      <w:pPr>
+        <w:ind w:left="6480" w:hanging="360"/>
+      </w:pPr>
+      <w:rPr>
+        <w:rFonts w:ascii="Wingdings" w:hAnsi="Wingdings" w:hint="default"/>
+      </w:rPr>
+    </w:lvl>
+  </w:abstractNum>
+  <w:abstractNum w:abstractNumId="6" w15:restartNumberingAfterBreak="0">
     <w:nsid w:val="1AE566EB"/>
     <w:multiLevelType w:val="hybridMultilevel"/>
     <w:tmpl w:val="284E9C72"/>
@@ -3554,7 +4637,7 @@
       </w:rPr>
     </w:lvl>
   </w:abstractNum>
-  <w:abstractNum w:abstractNumId="6" w15:restartNumberingAfterBreak="0">
+  <w:abstractNum w:abstractNumId="7" w15:restartNumberingAfterBreak="0">
     <w:nsid w:val="1BFE1C95"/>
     <w:multiLevelType w:val="hybridMultilevel"/>
     <w:tmpl w:val="06A8CA46"/>
@@ -3667,7 +4750,7 @@
       </w:rPr>
     </w:lvl>
   </w:abstractNum>
-  <w:abstractNum w:abstractNumId="7" w15:restartNumberingAfterBreak="0">
+  <w:abstractNum w:abstractNumId="8" w15:restartNumberingAfterBreak="0">
     <w:nsid w:val="1EF854D3"/>
     <w:multiLevelType w:val="multilevel"/>
     <w:tmpl w:val="D3E0D828"/>
@@ -3780,7 +4863,7 @@
       </w:pPr>
     </w:lvl>
   </w:abstractNum>
-  <w:abstractNum w:abstractNumId="8" w15:restartNumberingAfterBreak="0">
+  <w:abstractNum w:abstractNumId="9" w15:restartNumberingAfterBreak="0">
     <w:nsid w:val="504C3985"/>
     <w:multiLevelType w:val="hybridMultilevel"/>
     <w:tmpl w:val="6B760236"/>
@@ -3893,7 +4976,120 @@
       </w:rPr>
     </w:lvl>
   </w:abstractNum>
-  <w:abstractNum w:abstractNumId="9" w15:restartNumberingAfterBreak="0">
+  <w:abstractNum w:abstractNumId="10" w15:restartNumberingAfterBreak="0">
+    <w:nsid w:val="50DC43D5"/>
+    <w:multiLevelType w:val="hybridMultilevel"/>
+    <w:tmpl w:val="F9E68254"/>
+    <w:lvl w:ilvl="0" w:tplc="992A8E5C">
+      <w:start w:val="1"/>
+      <w:numFmt w:val="bullet"/>
+      <w:lvlText w:val=""/>
+      <w:lvlJc w:val="left"/>
+      <w:pPr>
+        <w:ind w:left="720" w:hanging="360"/>
+      </w:pPr>
+      <w:rPr>
+        <w:rFonts w:ascii="Symbol" w:hAnsi="Symbol" w:hint="default"/>
+      </w:rPr>
+    </w:lvl>
+    <w:lvl w:ilvl="1" w:tplc="042A0003" w:tentative="1">
+      <w:start w:val="1"/>
+      <w:numFmt w:val="bullet"/>
+      <w:lvlText w:val="o"/>
+      <w:lvlJc w:val="left"/>
+      <w:pPr>
+        <w:ind w:left="1440" w:hanging="360"/>
+      </w:pPr>
+      <w:rPr>
+        <w:rFonts w:ascii="Courier New" w:hAnsi="Courier New" w:cs="Courier New" w:hint="default"/>
+      </w:rPr>
+    </w:lvl>
+    <w:lvl w:ilvl="2" w:tplc="042A0005" w:tentative="1">
+      <w:start w:val="1"/>
+      <w:numFmt w:val="bullet"/>
+      <w:lvlText w:val=""/>
+      <w:lvlJc w:val="left"/>
+      <w:pPr>
+        <w:ind w:left="2160" w:hanging="360"/>
+      </w:pPr>
+      <w:rPr>
+        <w:rFonts w:ascii="Wingdings" w:hAnsi="Wingdings" w:hint="default"/>
+      </w:rPr>
+    </w:lvl>
+    <w:lvl w:ilvl="3" w:tplc="042A0001" w:tentative="1">
+      <w:start w:val="1"/>
+      <w:numFmt w:val="bullet"/>
+      <w:lvlText w:val=""/>
+      <w:lvlJc w:val="left"/>
+      <w:pPr>
+        <w:ind w:left="2880" w:hanging="360"/>
+      </w:pPr>
+      <w:rPr>
+        <w:rFonts w:ascii="Symbol" w:hAnsi="Symbol" w:hint="default"/>
+      </w:rPr>
+    </w:lvl>
+    <w:lvl w:ilvl="4" w:tplc="042A0003" w:tentative="1">
+      <w:start w:val="1"/>
+      <w:numFmt w:val="bullet"/>
+      <w:lvlText w:val="o"/>
+      <w:lvlJc w:val="left"/>
+      <w:pPr>
+        <w:ind w:left="3600" w:hanging="360"/>
+      </w:pPr>
+      <w:rPr>
+        <w:rFonts w:ascii="Courier New" w:hAnsi="Courier New" w:cs="Courier New" w:hint="default"/>
+      </w:rPr>
+    </w:lvl>
+    <w:lvl w:ilvl="5" w:tplc="042A0005" w:tentative="1">
+      <w:start w:val="1"/>
+      <w:numFmt w:val="bullet"/>
+      <w:lvlText w:val=""/>
+      <w:lvlJc w:val="left"/>
+      <w:pPr>
+        <w:ind w:left="4320" w:hanging="360"/>
+      </w:pPr>
+      <w:rPr>
+        <w:rFonts w:ascii="Wingdings" w:hAnsi="Wingdings" w:hint="default"/>
+      </w:rPr>
+    </w:lvl>
+    <w:lvl w:ilvl="6" w:tplc="042A0001" w:tentative="1">
+      <w:start w:val="1"/>
+      <w:numFmt w:val="bullet"/>
+      <w:lvlText w:val=""/>
+      <w:lvlJc w:val="left"/>
+      <w:pPr>
+        <w:ind w:left="5040" w:hanging="360"/>
+      </w:pPr>
+      <w:rPr>
+        <w:rFonts w:ascii="Symbol" w:hAnsi="Symbol" w:hint="default"/>
+      </w:rPr>
+    </w:lvl>
+    <w:lvl w:ilvl="7" w:tplc="042A0003" w:tentative="1">
+      <w:start w:val="1"/>
+      <w:numFmt w:val="bullet"/>
+      <w:lvlText w:val="o"/>
+      <w:lvlJc w:val="left"/>
+      <w:pPr>
+        <w:ind w:left="5760" w:hanging="360"/>
+      </w:pPr>
+      <w:rPr>
+        <w:rFonts w:ascii="Courier New" w:hAnsi="Courier New" w:cs="Courier New" w:hint="default"/>
+      </w:rPr>
+    </w:lvl>
+    <w:lvl w:ilvl="8" w:tplc="042A0005" w:tentative="1">
+      <w:start w:val="1"/>
+      <w:numFmt w:val="bullet"/>
+      <w:lvlText w:val=""/>
+      <w:lvlJc w:val="left"/>
+      <w:pPr>
+        <w:ind w:left="6480" w:hanging="360"/>
+      </w:pPr>
+      <w:rPr>
+        <w:rFonts w:ascii="Wingdings" w:hAnsi="Wingdings" w:hint="default"/>
+      </w:rPr>
+    </w:lvl>
+  </w:abstractNum>
+  <w:abstractNum w:abstractNumId="11" w15:restartNumberingAfterBreak="0">
     <w:nsid w:val="545576F4"/>
     <w:multiLevelType w:val="multilevel"/>
     <w:tmpl w:val="6AE68C5E"/>
@@ -4006,7 +5202,120 @@
       </w:pPr>
     </w:lvl>
   </w:abstractNum>
-  <w:abstractNum w:abstractNumId="10" w15:restartNumberingAfterBreak="0">
+  <w:abstractNum w:abstractNumId="12" w15:restartNumberingAfterBreak="0">
+    <w:nsid w:val="554155A2"/>
+    <w:multiLevelType w:val="hybridMultilevel"/>
+    <w:tmpl w:val="6F323312"/>
+    <w:lvl w:ilvl="0" w:tplc="992A8E5C">
+      <w:start w:val="1"/>
+      <w:numFmt w:val="bullet"/>
+      <w:lvlText w:val=""/>
+      <w:lvlJc w:val="left"/>
+      <w:pPr>
+        <w:ind w:left="720" w:hanging="360"/>
+      </w:pPr>
+      <w:rPr>
+        <w:rFonts w:ascii="Symbol" w:hAnsi="Symbol" w:hint="default"/>
+      </w:rPr>
+    </w:lvl>
+    <w:lvl w:ilvl="1" w:tplc="042A0001">
+      <w:start w:val="1"/>
+      <w:numFmt w:val="bullet"/>
+      <w:lvlText w:val=""/>
+      <w:lvlJc w:val="left"/>
+      <w:pPr>
+        <w:ind w:left="1070" w:hanging="360"/>
+      </w:pPr>
+      <w:rPr>
+        <w:rFonts w:ascii="Symbol" w:hAnsi="Symbol" w:hint="default"/>
+      </w:rPr>
+    </w:lvl>
+    <w:lvl w:ilvl="2" w:tplc="042A0005" w:tentative="1">
+      <w:start w:val="1"/>
+      <w:numFmt w:val="bullet"/>
+      <w:lvlText w:val=""/>
+      <w:lvlJc w:val="left"/>
+      <w:pPr>
+        <w:ind w:left="2160" w:hanging="360"/>
+      </w:pPr>
+      <w:rPr>
+        <w:rFonts w:ascii="Wingdings" w:hAnsi="Wingdings" w:hint="default"/>
+      </w:rPr>
+    </w:lvl>
+    <w:lvl w:ilvl="3" w:tplc="042A0001" w:tentative="1">
+      <w:start w:val="1"/>
+      <w:numFmt w:val="bullet"/>
+      <w:lvlText w:val=""/>
+      <w:lvlJc w:val="left"/>
+      <w:pPr>
+        <w:ind w:left="2880" w:hanging="360"/>
+      </w:pPr>
+      <w:rPr>
+        <w:rFonts w:ascii="Symbol" w:hAnsi="Symbol" w:hint="default"/>
+      </w:rPr>
+    </w:lvl>
+    <w:lvl w:ilvl="4" w:tplc="042A0003" w:tentative="1">
+      <w:start w:val="1"/>
+      <w:numFmt w:val="bullet"/>
+      <w:lvlText w:val="o"/>
+      <w:lvlJc w:val="left"/>
+      <w:pPr>
+        <w:ind w:left="3600" w:hanging="360"/>
+      </w:pPr>
+      <w:rPr>
+        <w:rFonts w:ascii="Courier New" w:hAnsi="Courier New" w:cs="Courier New" w:hint="default"/>
+      </w:rPr>
+    </w:lvl>
+    <w:lvl w:ilvl="5" w:tplc="042A0005" w:tentative="1">
+      <w:start w:val="1"/>
+      <w:numFmt w:val="bullet"/>
+      <w:lvlText w:val=""/>
+      <w:lvlJc w:val="left"/>
+      <w:pPr>
+        <w:ind w:left="4320" w:hanging="360"/>
+      </w:pPr>
+      <w:rPr>
+        <w:rFonts w:ascii="Wingdings" w:hAnsi="Wingdings" w:hint="default"/>
+      </w:rPr>
+    </w:lvl>
+    <w:lvl w:ilvl="6" w:tplc="042A0001" w:tentative="1">
+      <w:start w:val="1"/>
+      <w:numFmt w:val="bullet"/>
+      <w:lvlText w:val=""/>
+      <w:lvlJc w:val="left"/>
+      <w:pPr>
+        <w:ind w:left="5040" w:hanging="360"/>
+      </w:pPr>
+      <w:rPr>
+        <w:rFonts w:ascii="Symbol" w:hAnsi="Symbol" w:hint="default"/>
+      </w:rPr>
+    </w:lvl>
+    <w:lvl w:ilvl="7" w:tplc="042A0003" w:tentative="1">
+      <w:start w:val="1"/>
+      <w:numFmt w:val="bullet"/>
+      <w:lvlText w:val="o"/>
+      <w:lvlJc w:val="left"/>
+      <w:pPr>
+        <w:ind w:left="5760" w:hanging="360"/>
+      </w:pPr>
+      <w:rPr>
+        <w:rFonts w:ascii="Courier New" w:hAnsi="Courier New" w:cs="Courier New" w:hint="default"/>
+      </w:rPr>
+    </w:lvl>
+    <w:lvl w:ilvl="8" w:tplc="042A0005" w:tentative="1">
+      <w:start w:val="1"/>
+      <w:numFmt w:val="bullet"/>
+      <w:lvlText w:val=""/>
+      <w:lvlJc w:val="left"/>
+      <w:pPr>
+        <w:ind w:left="6480" w:hanging="360"/>
+      </w:pPr>
+      <w:rPr>
+        <w:rFonts w:ascii="Wingdings" w:hAnsi="Wingdings" w:hint="default"/>
+      </w:rPr>
+    </w:lvl>
+  </w:abstractNum>
+  <w:abstractNum w:abstractNumId="13" w15:restartNumberingAfterBreak="0">
     <w:nsid w:val="564318AE"/>
     <w:multiLevelType w:val="hybridMultilevel"/>
     <w:tmpl w:val="D2082B5A"/>
@@ -4119,7 +5428,7 @@
       </w:rPr>
     </w:lvl>
   </w:abstractNum>
-  <w:abstractNum w:abstractNumId="11" w15:restartNumberingAfterBreak="0">
+  <w:abstractNum w:abstractNumId="14" w15:restartNumberingAfterBreak="0">
     <w:nsid w:val="69E00E83"/>
     <w:multiLevelType w:val="hybridMultilevel"/>
     <w:tmpl w:val="C9F68B40"/>
@@ -4232,7 +5541,7 @@
       </w:rPr>
     </w:lvl>
   </w:abstractNum>
-  <w:abstractNum w:abstractNumId="12" w15:restartNumberingAfterBreak="0">
+  <w:abstractNum w:abstractNumId="15" w15:restartNumberingAfterBreak="0">
     <w:nsid w:val="6C5B400B"/>
     <w:multiLevelType w:val="hybridMultilevel"/>
     <w:tmpl w:val="5252752C"/>
@@ -4345,7 +5654,7 @@
       </w:rPr>
     </w:lvl>
   </w:abstractNum>
-  <w:abstractNum w:abstractNumId="13" w15:restartNumberingAfterBreak="0">
+  <w:abstractNum w:abstractNumId="16" w15:restartNumberingAfterBreak="0">
     <w:nsid w:val="6D302533"/>
     <w:multiLevelType w:val="multilevel"/>
     <w:tmpl w:val="C01EF808"/>
@@ -4494,7 +5803,7 @@
       </w:rPr>
     </w:lvl>
   </w:abstractNum>
-  <w:abstractNum w:abstractNumId="14" w15:restartNumberingAfterBreak="0">
+  <w:abstractNum w:abstractNumId="17" w15:restartNumberingAfterBreak="0">
     <w:nsid w:val="71CF6F55"/>
     <w:multiLevelType w:val="multilevel"/>
     <w:tmpl w:val="A6083558"/>
@@ -4643,7 +5952,7 @@
       </w:rPr>
     </w:lvl>
   </w:abstractNum>
-  <w:abstractNum w:abstractNumId="15" w15:restartNumberingAfterBreak="0">
+  <w:abstractNum w:abstractNumId="18" w15:restartNumberingAfterBreak="0">
     <w:nsid w:val="73106A66"/>
     <w:multiLevelType w:val="hybridMultilevel"/>
     <w:tmpl w:val="135AB5A2"/>
@@ -4756,7 +6065,7 @@
       </w:rPr>
     </w:lvl>
   </w:abstractNum>
-  <w:abstractNum w:abstractNumId="16" w15:restartNumberingAfterBreak="0">
+  <w:abstractNum w:abstractNumId="19" w15:restartNumberingAfterBreak="0">
     <w:nsid w:val="73E146ED"/>
     <w:multiLevelType w:val="hybridMultilevel"/>
     <w:tmpl w:val="4C245342"/>
@@ -4869,7 +6178,7 @@
       </w:rPr>
     </w:lvl>
   </w:abstractNum>
-  <w:abstractNum w:abstractNumId="17" w15:restartNumberingAfterBreak="0">
+  <w:abstractNum w:abstractNumId="20" w15:restartNumberingAfterBreak="0">
     <w:nsid w:val="74011CB3"/>
     <w:multiLevelType w:val="hybridMultilevel"/>
     <w:tmpl w:val="8C10EAE0"/>
@@ -4982,7 +6291,7 @@
       </w:rPr>
     </w:lvl>
   </w:abstractNum>
-  <w:abstractNum w:abstractNumId="18" w15:restartNumberingAfterBreak="0">
+  <w:abstractNum w:abstractNumId="21" w15:restartNumberingAfterBreak="0">
     <w:nsid w:val="7C936744"/>
     <w:multiLevelType w:val="multilevel"/>
     <w:tmpl w:val="B768BFB0"/>
@@ -5095,7 +6404,7 @@
       </w:pPr>
     </w:lvl>
   </w:abstractNum>
-  <w:abstractNum w:abstractNumId="19" w15:restartNumberingAfterBreak="0">
+  <w:abstractNum w:abstractNumId="22" w15:restartNumberingAfterBreak="0">
     <w:nsid w:val="7CD24DA1"/>
     <w:multiLevelType w:val="multilevel"/>
     <w:tmpl w:val="CEBEF10C"/>
@@ -5248,61 +6557,70 @@
     <w:abstractNumId w:val="4"/>
   </w:num>
   <w:num w:numId="2" w16cid:durableId="1200245046">
-    <w:abstractNumId w:val="11"/>
+    <w:abstractNumId w:val="14"/>
   </w:num>
   <w:num w:numId="3" w16cid:durableId="430395695">
-    <w:abstractNumId w:val="8"/>
+    <w:abstractNumId w:val="9"/>
   </w:num>
   <w:num w:numId="4" w16cid:durableId="229579961">
-    <w:abstractNumId w:val="6"/>
+    <w:abstractNumId w:val="7"/>
   </w:num>
   <w:num w:numId="5" w16cid:durableId="1554268567">
-    <w:abstractNumId w:val="17"/>
+    <w:abstractNumId w:val="20"/>
   </w:num>
   <w:num w:numId="6" w16cid:durableId="1572888768">
+    <w:abstractNumId w:val="18"/>
+  </w:num>
+  <w:num w:numId="7" w16cid:durableId="1604418861">
+    <w:abstractNumId w:val="19"/>
+  </w:num>
+  <w:num w:numId="8" w16cid:durableId="278269448">
+    <w:abstractNumId w:val="13"/>
+  </w:num>
+  <w:num w:numId="9" w16cid:durableId="187985399">
     <w:abstractNumId w:val="15"/>
   </w:num>
-  <w:num w:numId="7" w16cid:durableId="1604418861">
-    <w:abstractNumId w:val="16"/>
-  </w:num>
-  <w:num w:numId="8" w16cid:durableId="278269448">
-    <w:abstractNumId w:val="10"/>
-  </w:num>
-  <w:num w:numId="9" w16cid:durableId="187985399">
-    <w:abstractNumId w:val="12"/>
-  </w:num>
   <w:num w:numId="10" w16cid:durableId="219480590">
-    <w:abstractNumId w:val="19"/>
+    <w:abstractNumId w:val="22"/>
   </w:num>
   <w:num w:numId="11" w16cid:durableId="602764696">
     <w:abstractNumId w:val="3"/>
   </w:num>
   <w:num w:numId="12" w16cid:durableId="146632657">
-    <w:abstractNumId w:val="7"/>
+    <w:abstractNumId w:val="8"/>
   </w:num>
   <w:num w:numId="13" w16cid:durableId="1039166049">
-    <w:abstractNumId w:val="18"/>
+    <w:abstractNumId w:val="21"/>
   </w:num>
   <w:num w:numId="14" w16cid:durableId="693728250">
-    <w:abstractNumId w:val="9"/>
+    <w:abstractNumId w:val="11"/>
   </w:num>
   <w:num w:numId="15" w16cid:durableId="1968048351">
     <w:abstractNumId w:val="1"/>
   </w:num>
   <w:num w:numId="16" w16cid:durableId="1792238043">
-    <w:abstractNumId w:val="14"/>
+    <w:abstractNumId w:val="17"/>
   </w:num>
   <w:num w:numId="17" w16cid:durableId="1405487845">
-    <w:abstractNumId w:val="5"/>
+    <w:abstractNumId w:val="6"/>
   </w:num>
   <w:num w:numId="18" w16cid:durableId="1456603648">
-    <w:abstractNumId w:val="13"/>
+    <w:abstractNumId w:val="16"/>
   </w:num>
   <w:num w:numId="19" w16cid:durableId="869033353">
     <w:abstractNumId w:val="2"/>
   </w:num>
   <w:num w:numId="20" w16cid:durableId="1867255245">
     <w:abstractNumId w:val="0"/>
+  </w:num>
+  <w:num w:numId="21" w16cid:durableId="1192109036">
+    <w:abstractNumId w:val="12"/>
+  </w:num>
+  <w:num w:numId="22" w16cid:durableId="86973173">
+    <w:abstractNumId w:val="10"/>
+  </w:num>
+  <w:num w:numId="23" w16cid:durableId="1615750818">
+    <w:abstractNumId w:val="5"/>
   </w:num>
 </w:numbering>
 </file>
@@ -5706,7 +7024,7 @@
   <w:style w:type="paragraph" w:default="1" w:styleId="Binhthng">
     <w:name w:val="Normal"/>
     <w:qFormat/>
-    <w:rsid w:val="00636319"/>
+    <w:rsid w:val="00234BD2"/>
   </w:style>
   <w:style w:type="paragraph" w:styleId="u1">
     <w:name w:val="heading 1"/>

</xml_diff>